<commit_message>
ss added to practcal 3
</commit_message>
<xml_diff>
--- a/Practical3.docx
+++ b/Practical3.docx
@@ -224,6 +224,7 @@
         <w:rPr>
           <w:b/>
           <w:bCs/>
+          <w:noProof/>
           <w:sz w:val="20"/>
           <w:szCs w:val="20"/>
         </w:rPr>
@@ -710,6 +711,7 @@
       </w:r>
       <w:r>
         <w:rPr>
+          <w:noProof/>
           <w:sz w:val="20"/>
           <w:szCs w:val="20"/>
           <w:lang w:val="en-US"/>
@@ -752,6 +754,7 @@
       </w:r>
       <w:r>
         <w:rPr>
+          <w:noProof/>
           <w:sz w:val="20"/>
           <w:szCs w:val="20"/>
           <w:lang w:val="en-US"/>
@@ -795,6 +798,7 @@
       </w:r>
       <w:r>
         <w:rPr>
+          <w:noProof/>
           <w:sz w:val="20"/>
           <w:szCs w:val="20"/>
           <w:lang w:val="en-US"/>
@@ -824,6 +828,57 @@
                     <a:xfrm>
                       <a:off x="0" y="0"/>
                       <a:ext cx="5731510" cy="2117090"/>
+                    </a:xfrm>
+                    <a:prstGeom prst="rect">
+                      <a:avLst/>
+                    </a:prstGeom>
+                  </pic:spPr>
+                </pic:pic>
+              </a:graphicData>
+            </a:graphic>
+          </wp:inline>
+        </w:drawing>
+      </w:r>
+    </w:p>
+    <w:p>
+      <w:pPr>
+        <w:rPr>
+          <w:sz w:val="20"/>
+          <w:szCs w:val="20"/>
+          <w:lang w:val="en-US"/>
+        </w:rPr>
+      </w:pPr>
+      <w:r>
+        <w:rPr>
+          <w:sz w:val="20"/>
+          <w:szCs w:val="20"/>
+          <w:lang w:val="en-US"/>
+        </w:rPr>
+        <w:drawing>
+          <wp:inline distT="0" distB="0" distL="0" distR="0" wp14:anchorId="56CBD905" wp14:editId="655178FE">
+            <wp:extent cx="5039428" cy="1247949"/>
+            <wp:effectExtent l="0" t="0" r="8890" b="9525"/>
+            <wp:docPr id="1485739812" name="Picture 1"/>
+            <wp:cNvGraphicFramePr>
+              <a:graphicFrameLocks xmlns:a="http://schemas.openxmlformats.org/drawingml/2006/main" noChangeAspect="1"/>
+            </wp:cNvGraphicFramePr>
+            <a:graphic xmlns:a="http://schemas.openxmlformats.org/drawingml/2006/main">
+              <a:graphicData uri="http://schemas.openxmlformats.org/drawingml/2006/picture">
+                <pic:pic xmlns:pic="http://schemas.openxmlformats.org/drawingml/2006/picture">
+                  <pic:nvPicPr>
+                    <pic:cNvPr id="1485739812" name=""/>
+                    <pic:cNvPicPr/>
+                  </pic:nvPicPr>
+                  <pic:blipFill>
+                    <a:blip r:embed="rId8"/>
+                    <a:stretch>
+                      <a:fillRect/>
+                    </a:stretch>
+                  </pic:blipFill>
+                  <pic:spPr>
+                    <a:xfrm>
+                      <a:off x="0" y="0"/>
+                      <a:ext cx="5039428" cy="1247949"/>
                     </a:xfrm>
                     <a:prstGeom prst="rect">
                       <a:avLst/>

</xml_diff>